<commit_message>
se agregaron los textos para la generacion del documento
</commit_message>
<xml_diff>
--- a/app/templates/template_demanda.docx
+++ b/app/templates/template_demanda.docx
@@ -2759,6 +2759,41 @@
           <w:highlight w:val="green"/>
         </w:rPr>
         <w:t>+++</w:t>
+      </w:r>
+    </w:p>
+    <w:p>
+      <w:pPr>
+        <w:spacing w:after="0" w:line="360" w:lineRule="auto"/>
+        <w:ind w:firstLine="708"/>
+        <w:jc w:val="both"/>
+        <w:rPr>
+          <w:rFonts w:cstheme="minorHAnsi"/>
+          <w:b/>
+          <w:sz w:val="24"/>
+          <w:szCs w:val="24"/>
+        </w:rPr>
+      </w:pPr>
+    </w:p>
+    <w:p>
+      <w:pPr>
+        <w:spacing w:after="0" w:line="360" w:lineRule="auto"/>
+        <w:ind w:firstLine="708"/>
+        <w:jc w:val="both"/>
+        <w:rPr>
+          <w:rFonts w:cstheme="minorHAnsi"/>
+          <w:b/>
+          <w:sz w:val="24"/>
+          <w:szCs w:val="24"/>
+        </w:rPr>
+      </w:pPr>
+      <w:r>
+        <w:rPr>
+          <w:rFonts w:cstheme="minorHAnsi"/>
+          <w:b/>
+          <w:sz w:val="24"/>
+          <w:szCs w:val="24"/>
+        </w:rPr>
+        <w:t>+++clausulas+++</w:t>
       </w:r>
     </w:p>
     <w:p>
@@ -4129,12 +4164,14 @@
 </file>
 
 <file path=customXml/item1.xml><?xml version="1.0" encoding="utf-8"?>
-<?mso-contentType ?>
-<FormTemplates xmlns="http://schemas.microsoft.com/sharepoint/v3/contenttype/forms">
-  <Display>DocumentLibraryForm</Display>
-  <Edit>DocumentLibraryForm</Edit>
-  <New>DocumentLibraryForm</New>
-</FormTemplates>
+<p:properties xmlns:p="http://schemas.microsoft.com/office/2006/metadata/properties" xmlns:xsi="http://www.w3.org/2001/XMLSchema-instance" xmlns:pc="http://schemas.microsoft.com/office/infopath/2007/PartnerControls">
+  <documentManagement>
+    <lcf76f155ced4ddcb4097134ff3c332f xmlns="2dd5cc6d-f845-4b74-a9d4-0c2932b01156">
+      <Terms xmlns="http://schemas.microsoft.com/office/infopath/2007/PartnerControls"/>
+    </lcf76f155ced4ddcb4097134ff3c332f>
+    <TaxCatchAll xmlns="fe7e8eae-8f19-43b5-a199-e3dfa6648a7c" xsi:nil="true"/>
+  </documentManagement>
+</p:properties>
 </file>
 
 <file path=customXml/item2.xml><?xml version="1.0" encoding="utf-8"?>
@@ -4345,14 +4382,12 @@
 </file>
 
 <file path=customXml/item3.xml><?xml version="1.0" encoding="utf-8"?>
-<p:properties xmlns:p="http://schemas.microsoft.com/office/2006/metadata/properties" xmlns:xsi="http://www.w3.org/2001/XMLSchema-instance" xmlns:pc="http://schemas.microsoft.com/office/infopath/2007/PartnerControls">
-  <documentManagement>
-    <lcf76f155ced4ddcb4097134ff3c332f xmlns="2dd5cc6d-f845-4b74-a9d4-0c2932b01156">
-      <Terms xmlns="http://schemas.microsoft.com/office/infopath/2007/PartnerControls"/>
-    </lcf76f155ced4ddcb4097134ff3c332f>
-    <TaxCatchAll xmlns="fe7e8eae-8f19-43b5-a199-e3dfa6648a7c" xsi:nil="true"/>
-  </documentManagement>
-</p:properties>
+<?mso-contentType ?>
+<FormTemplates xmlns="http://schemas.microsoft.com/sharepoint/v3/contenttype/forms">
+  <Display>DocumentLibraryForm</Display>
+  <Edit>DocumentLibraryForm</Edit>
+  <New>DocumentLibraryForm</New>
+</FormTemplates>
 </file>
 
 <file path=customXml/item4.xml><?xml version="1.0" encoding="utf-8"?>
@@ -4360,9 +4395,12 @@
 </file>
 
 <file path=customXml/itemProps1.xml><?xml version="1.0" encoding="utf-8"?>
-<ds:datastoreItem xmlns:ds="http://schemas.openxmlformats.org/officeDocument/2006/customXml" ds:itemID="{A9FEAF85-3C16-4730-9AF2-6067570A11B0}">
+<ds:datastoreItem xmlns:ds="http://schemas.openxmlformats.org/officeDocument/2006/customXml" ds:itemID="{42A9E0C2-AB1C-48D2-B720-396EA4581806}">
   <ds:schemaRefs>
-    <ds:schemaRef ds:uri="http://schemas.microsoft.com/sharepoint/v3/contenttype/forms"/>
+    <ds:schemaRef ds:uri="http://schemas.microsoft.com/office/2006/metadata/properties"/>
+    <ds:schemaRef ds:uri="http://schemas.microsoft.com/office/infopath/2007/PartnerControls"/>
+    <ds:schemaRef ds:uri="2dd5cc6d-f845-4b74-a9d4-0c2932b01156"/>
+    <ds:schemaRef ds:uri="fe7e8eae-8f19-43b5-a199-e3dfa6648a7c"/>
   </ds:schemaRefs>
 </ds:datastoreItem>
 </file>
@@ -4387,12 +4425,9 @@
 </file>
 
 <file path=customXml/itemProps3.xml><?xml version="1.0" encoding="utf-8"?>
-<ds:datastoreItem xmlns:ds="http://schemas.openxmlformats.org/officeDocument/2006/customXml" ds:itemID="{42A9E0C2-AB1C-48D2-B720-396EA4581806}">
+<ds:datastoreItem xmlns:ds="http://schemas.openxmlformats.org/officeDocument/2006/customXml" ds:itemID="{A9FEAF85-3C16-4730-9AF2-6067570A11B0}">
   <ds:schemaRefs>
-    <ds:schemaRef ds:uri="http://schemas.microsoft.com/office/2006/metadata/properties"/>
-    <ds:schemaRef ds:uri="http://schemas.microsoft.com/office/infopath/2007/PartnerControls"/>
-    <ds:schemaRef ds:uri="2dd5cc6d-f845-4b74-a9d4-0c2932b01156"/>
-    <ds:schemaRef ds:uri="fe7e8eae-8f19-43b5-a199-e3dfa6648a7c"/>
+    <ds:schemaRef ds:uri="http://schemas.microsoft.com/sharepoint/v3/contenttype/forms"/>
   </ds:schemaRefs>
 </ds:datastoreItem>
 </file>

</xml_diff>

<commit_message>
chore: update abogados application development
</commit_message>
<xml_diff>
--- a/app/templates/template_demanda.docx
+++ b/app/templates/template_demanda.docx
@@ -2590,10 +2590,7 @@
         <w:t xml:space="preserve">  en  contra  de</w:t>
       </w:r>
       <w:r>
-        <w:t xml:space="preserve"> </w:t>
-      </w:r>
-      <w:r>
-        <w:t xml:space="preserve">+++IF </w:t>
+        <w:t xml:space="preserve"> +++IF </w:t>
       </w:r>
       <w:proofErr w:type="spellStart"/>
       <w:r>
@@ -3312,7 +3309,39 @@
           <w:szCs w:val="24"/>
           <w:highlight w:val="lightGray"/>
         </w:rPr>
-        <w:t>+++clausulas+++</w:t>
+        <w:t>+++</w:t>
+      </w:r>
+      <w:proofErr w:type="spellStart"/>
+      <w:r>
+        <w:rPr>
+          <w:rFonts w:cstheme="minorHAnsi"/>
+          <w:b/>
+          <w:sz w:val="24"/>
+          <w:szCs w:val="24"/>
+          <w:highlight w:val="lightGray"/>
+        </w:rPr>
+        <w:t>clausulas</w:t>
+      </w:r>
+      <w:r>
+        <w:rPr>
+          <w:rFonts w:cstheme="minorHAnsi"/>
+          <w:b/>
+          <w:sz w:val="24"/>
+          <w:szCs w:val="24"/>
+          <w:highlight w:val="lightGray"/>
+        </w:rPr>
+        <w:t>_encabezado</w:t>
+      </w:r>
+      <w:proofErr w:type="spellEnd"/>
+      <w:r>
+        <w:rPr>
+          <w:rFonts w:cstheme="minorHAnsi"/>
+          <w:b/>
+          <w:sz w:val="24"/>
+          <w:szCs w:val="24"/>
+          <w:highlight w:val="lightGray"/>
+        </w:rPr>
+        <w:t>+++</w:t>
       </w:r>
     </w:p>
     <w:p>
@@ -3327,6 +3356,87 @@
           <w:szCs w:val="24"/>
         </w:rPr>
       </w:pPr>
+    </w:p>
+    <w:p>
+      <w:pPr>
+        <w:spacing w:after="0" w:line="360" w:lineRule="auto"/>
+        <w:ind w:firstLine="708"/>
+        <w:jc w:val="both"/>
+        <w:rPr>
+          <w:rFonts w:cstheme="minorHAnsi"/>
+          <w:b/>
+          <w:sz w:val="24"/>
+          <w:szCs w:val="24"/>
+        </w:rPr>
+      </w:pPr>
+      <w:r>
+        <w:rPr>
+          <w:rFonts w:cstheme="minorHAnsi"/>
+          <w:b/>
+          <w:sz w:val="24"/>
+          <w:szCs w:val="24"/>
+          <w:highlight w:val="cyan"/>
+        </w:rPr>
+        <w:t>+++</w:t>
+      </w:r>
+      <w:proofErr w:type="spellStart"/>
+      <w:r>
+        <w:rPr>
+          <w:rFonts w:cstheme="minorHAnsi"/>
+          <w:b/>
+          <w:sz w:val="24"/>
+          <w:szCs w:val="24"/>
+          <w:highlight w:val="cyan"/>
+        </w:rPr>
+        <w:t>clausulas</w:t>
+      </w:r>
+      <w:r>
+        <w:rPr>
+          <w:rFonts w:cstheme="minorHAnsi"/>
+          <w:b/>
+          <w:sz w:val="24"/>
+          <w:szCs w:val="24"/>
+          <w:highlight w:val="cyan"/>
+        </w:rPr>
+        <w:t>_hechos</w:t>
+      </w:r>
+      <w:proofErr w:type="spellEnd"/>
+      <w:r>
+        <w:rPr>
+          <w:rFonts w:cstheme="minorHAnsi"/>
+          <w:b/>
+          <w:sz w:val="24"/>
+          <w:szCs w:val="24"/>
+          <w:highlight w:val="cyan"/>
+        </w:rPr>
+        <w:t>+++</w:t>
+      </w:r>
+    </w:p>
+    <w:p>
+      <w:pPr>
+        <w:spacing w:after="0" w:line="360" w:lineRule="auto"/>
+        <w:ind w:firstLine="708"/>
+        <w:jc w:val="both"/>
+        <w:rPr>
+          <w:rFonts w:cstheme="minorHAnsi"/>
+          <w:b/>
+          <w:sz w:val="24"/>
+          <w:szCs w:val="24"/>
+        </w:rPr>
+      </w:pPr>
+    </w:p>
+    <w:p>
+      <w:pPr>
+        <w:spacing w:after="0" w:line="360" w:lineRule="auto"/>
+        <w:ind w:firstLine="708"/>
+        <w:jc w:val="both"/>
+        <w:rPr>
+          <w:rFonts w:cstheme="minorHAnsi"/>
+          <w:b/>
+          <w:sz w:val="24"/>
+          <w:szCs w:val="24"/>
+        </w:rPr>
+      </w:pPr>
       <w:r>
         <w:rPr>
           <w:rFonts w:cstheme="minorHAnsi"/>
@@ -3335,6 +3445,142 @@
           <w:szCs w:val="24"/>
         </w:rPr>
         <w:t>EL DERECHO</w:t>
+      </w:r>
+    </w:p>
+    <w:p>
+      <w:pPr>
+        <w:spacing w:after="0" w:line="360" w:lineRule="auto"/>
+        <w:ind w:firstLine="708"/>
+        <w:jc w:val="both"/>
+        <w:rPr>
+          <w:rFonts w:cstheme="minorHAnsi"/>
+          <w:b/>
+          <w:sz w:val="24"/>
+          <w:szCs w:val="24"/>
+        </w:rPr>
+      </w:pPr>
+    </w:p>
+    <w:p>
+      <w:pPr>
+        <w:spacing w:after="0" w:line="360" w:lineRule="auto"/>
+        <w:ind w:firstLine="708"/>
+        <w:jc w:val="both"/>
+        <w:rPr>
+          <w:rFonts w:cstheme="minorHAnsi"/>
+          <w:b/>
+          <w:sz w:val="24"/>
+          <w:szCs w:val="24"/>
+        </w:rPr>
+      </w:pPr>
+      <w:r>
+        <w:rPr>
+          <w:rFonts w:cstheme="minorHAnsi"/>
+          <w:b/>
+          <w:sz w:val="24"/>
+          <w:szCs w:val="24"/>
+          <w:highlight w:val="red"/>
+        </w:rPr>
+        <w:t>+++</w:t>
+      </w:r>
+      <w:proofErr w:type="spellStart"/>
+      <w:r>
+        <w:rPr>
+          <w:rFonts w:cstheme="minorHAnsi"/>
+          <w:b/>
+          <w:sz w:val="24"/>
+          <w:szCs w:val="24"/>
+          <w:highlight w:val="red"/>
+        </w:rPr>
+        <w:t>clausulas</w:t>
+      </w:r>
+      <w:r>
+        <w:rPr>
+          <w:rFonts w:cstheme="minorHAnsi"/>
+          <w:b/>
+          <w:sz w:val="24"/>
+          <w:szCs w:val="24"/>
+          <w:highlight w:val="red"/>
+        </w:rPr>
+        <w:t>_derecho</w:t>
+      </w:r>
+      <w:proofErr w:type="spellEnd"/>
+      <w:r>
+        <w:rPr>
+          <w:rFonts w:cstheme="minorHAnsi"/>
+          <w:b/>
+          <w:sz w:val="24"/>
+          <w:szCs w:val="24"/>
+          <w:highlight w:val="red"/>
+        </w:rPr>
+        <w:t>+++</w:t>
+      </w:r>
+    </w:p>
+    <w:p>
+      <w:pPr>
+        <w:spacing w:after="0" w:line="360" w:lineRule="auto"/>
+        <w:ind w:firstLine="708"/>
+        <w:jc w:val="both"/>
+        <w:rPr>
+          <w:rFonts w:cstheme="minorHAnsi"/>
+          <w:b/>
+          <w:sz w:val="24"/>
+          <w:szCs w:val="24"/>
+        </w:rPr>
+      </w:pPr>
+    </w:p>
+    <w:p>
+      <w:pPr>
+        <w:spacing w:after="0" w:line="360" w:lineRule="auto"/>
+        <w:ind w:firstLine="708"/>
+        <w:jc w:val="both"/>
+        <w:rPr>
+          <w:rFonts w:cstheme="minorHAnsi"/>
+          <w:b/>
+          <w:sz w:val="24"/>
+          <w:szCs w:val="24"/>
+        </w:rPr>
+      </w:pPr>
+      <w:r>
+        <w:rPr>
+          <w:rFonts w:cstheme="minorHAnsi"/>
+          <w:b/>
+          <w:sz w:val="24"/>
+          <w:szCs w:val="24"/>
+          <w:highlight w:val="darkGray"/>
+        </w:rPr>
+        <w:t>+++</w:t>
+      </w:r>
+      <w:proofErr w:type="spellStart"/>
+      <w:r>
+        <w:rPr>
+          <w:rFonts w:cstheme="minorHAnsi"/>
+          <w:b/>
+          <w:sz w:val="24"/>
+          <w:szCs w:val="24"/>
+          <w:highlight w:val="darkGray"/>
+        </w:rPr>
+        <w:t>clausulas</w:t>
+      </w:r>
+      <w:r>
+        <w:rPr>
+          <w:rFonts w:cstheme="minorHAnsi"/>
+          <w:b/>
+          <w:sz w:val="24"/>
+          <w:szCs w:val="24"/>
+          <w:highlight w:val="darkGray"/>
+        </w:rPr>
+        <w:t>_peticiones</w:t>
+      </w:r>
+      <w:proofErr w:type="spellEnd"/>
+      <w:r>
+        <w:rPr>
+          <w:rFonts w:cstheme="minorHAnsi"/>
+          <w:b/>
+          <w:sz w:val="24"/>
+          <w:szCs w:val="24"/>
+          <w:highlight w:val="darkGray"/>
+        </w:rPr>
+        <w:t>+++</w:t>
       </w:r>
     </w:p>
     <w:p>

</xml_diff>